<commit_message>
Abenteuer Mord auf hoher See
</commit_message>
<xml_diff>
--- a/docs/Bayerische Nächte/Geschichten/07_Kō kaijō no satsujin/Kō kaijō no satsujin_Geschichte.docx
+++ b/docs/Bayerische Nächte/Geschichten/07_Kō kaijō no satsujin/Kō kaijō no satsujin_Geschichte.docx
@@ -1,6 +1,6 @@
 
 <file path=word/document.xml><?xml version="1.0" encoding="utf-8"?>
-<w:document xmlns:wpc="http://schemas.microsoft.com/office/word/2010/wordprocessingCanvas" xmlns:cx="http://schemas.microsoft.com/office/drawing/2014/chartex" xmlns:cx1="http://schemas.microsoft.com/office/drawing/2015/9/8/chartex" xmlns:cx2="http://schemas.microsoft.com/office/drawing/2015/10/21/chartex" xmlns:cx3="http://schemas.microsoft.com/office/drawing/2016/5/9/chartex" xmlns:cx4="http://schemas.microsoft.com/office/drawing/2016/5/10/chartex" xmlns:cx5="http://schemas.microsoft.com/office/drawing/2016/5/11/chartex" xmlns:cx6="http://schemas.microsoft.com/office/drawing/2016/5/12/chartex" xmlns:cx7="http://schemas.microsoft.com/office/drawing/2016/5/13/chartex" xmlns:cx8="http://schemas.microsoft.com/office/drawing/2016/5/14/chartex" xmlns:mc="http://schemas.openxmlformats.org/markup-compatibility/2006" xmlns:aink="http://schemas.microsoft.com/office/drawing/2016/ink" xmlns:am3d="http://schemas.microsoft.com/office/drawing/2017/model3d" xmlns:o="urn:schemas-microsoft-com:office:office" xmlns:oel="http://schemas.microsoft.com/office/2019/extlst" xmlns:r="http://schemas.openxmlformats.org/officeDocument/2006/relationships" xmlns:m="http://schemas.openxmlformats.org/officeDocument/2006/math" xmlns:v="urn:schemas-microsoft-com:vml" xmlns:wp14="http://schemas.microsoft.com/office/word/2010/wordprocessingDrawing" xmlns:wp="http://schemas.openxmlformats.org/drawingml/2006/wordprocessingDrawing" xmlns:w10="urn:schemas-microsoft-com:office:word" xmlns:w="http://schemas.openxmlformats.org/wordprocessingml/2006/main" xmlns:w14="http://schemas.microsoft.com/office/word/2010/wordml" xmlns:w15="http://schemas.microsoft.com/office/word/2012/wordml" xmlns:w16cex="http://schemas.microsoft.com/office/word/2018/wordml/cex" xmlns:w16cid="http://schemas.microsoft.com/office/word/2016/wordml/cid" xmlns:w16="http://schemas.microsoft.com/office/word/2018/wordml" xmlns:w16du="http://schemas.microsoft.com/office/word/2023/wordml/word16du" xmlns:w16sdtdh="http://schemas.microsoft.com/office/word/2020/wordml/sdtdatahash" xmlns:w16se="http://schemas.microsoft.com/office/word/2015/wordml/symex" xmlns:wpg="http://schemas.microsoft.com/office/word/2010/wordprocessingGroup" xmlns:wpi="http://schemas.microsoft.com/office/word/2010/wordprocessingInk" xmlns:wne="http://schemas.microsoft.com/office/word/2006/wordml" xmlns:wps="http://schemas.microsoft.com/office/word/2010/wordprocessingShape" mc:Ignorable="w14 w15 w16se w16cid w16 w16cex w16sdtdh w16du wp14">
+<w:document xmlns:wpc="http://schemas.microsoft.com/office/word/2010/wordprocessingCanvas" xmlns:cx="http://schemas.microsoft.com/office/drawing/2014/chartex" xmlns:cx1="http://schemas.microsoft.com/office/drawing/2015/9/8/chartex" xmlns:cx2="http://schemas.microsoft.com/office/drawing/2015/10/21/chartex" xmlns:cx3="http://schemas.microsoft.com/office/drawing/2016/5/9/chartex" xmlns:cx4="http://schemas.microsoft.com/office/drawing/2016/5/10/chartex" xmlns:cx5="http://schemas.microsoft.com/office/drawing/2016/5/11/chartex" xmlns:cx6="http://schemas.microsoft.com/office/drawing/2016/5/12/chartex" xmlns:cx7="http://schemas.microsoft.com/office/drawing/2016/5/13/chartex" xmlns:cx8="http://schemas.microsoft.com/office/drawing/2016/5/14/chartex" xmlns:mc="http://schemas.openxmlformats.org/markup-compatibility/2006" xmlns:aink="http://schemas.microsoft.com/office/drawing/2016/ink" xmlns:am3d="http://schemas.microsoft.com/office/drawing/2017/model3d" xmlns:o="urn:schemas-microsoft-com:office:office" xmlns:oel="http://schemas.microsoft.com/office/2019/extlst" xmlns:r="http://schemas.openxmlformats.org/officeDocument/2006/relationships" xmlns:m="http://schemas.openxmlformats.org/officeDocument/2006/math" xmlns:v="urn:schemas-microsoft-com:vml" xmlns:wp14="http://schemas.microsoft.com/office/word/2010/wordprocessingDrawing" xmlns:wp="http://schemas.openxmlformats.org/drawingml/2006/wordprocessingDrawing" xmlns:w10="urn:schemas-microsoft-com:office:word" xmlns:w="http://schemas.openxmlformats.org/wordprocessingml/2006/main" xmlns:w14="http://schemas.microsoft.com/office/word/2010/wordml" xmlns:w15="http://schemas.microsoft.com/office/word/2012/wordml" xmlns:w16cex="http://schemas.microsoft.com/office/word/2018/wordml/cex" xmlns:w16cid="http://schemas.microsoft.com/office/word/2016/wordml/cid" xmlns:w16="http://schemas.microsoft.com/office/word/2018/wordml" xmlns:w16du="http://schemas.microsoft.com/office/word/2023/wordml/word16du" xmlns:w16sdtdh="http://schemas.microsoft.com/office/word/2020/wordml/sdtdatahash" xmlns:w16sdtfl="http://schemas.microsoft.com/office/word/2024/wordml/sdtformatlock" xmlns:w16se="http://schemas.microsoft.com/office/word/2015/wordml/symex" xmlns:wpg="http://schemas.microsoft.com/office/word/2010/wordprocessingGroup" xmlns:wpi="http://schemas.microsoft.com/office/word/2010/wordprocessingInk" xmlns:wne="http://schemas.microsoft.com/office/word/2006/wordml" xmlns:wps="http://schemas.microsoft.com/office/word/2010/wordprocessingShape" mc:Ignorable="w14 w15 w16se w16cid w16 w16cex w16sdtdh w16sdtfl w16du wp14">
   <w:body>
     <w:p>
       <w:pPr>
@@ -39,6 +39,9 @@
     <w:p>
       <w:pPr>
         <w:pStyle w:val="berschrift3"/>
+        <w:rPr>
+          <w:rFonts w:hint="eastAsia"/>
+        </w:rPr>
       </w:pPr>
       <w:r>
         <w:t>Musik und Ambiente:</w:t>
@@ -47,6 +50,9 @@
     <w:p>
       <w:pPr>
         <w:pStyle w:val="Textkrper"/>
+        <w:rPr>
+          <w:rFonts w:hint="eastAsia"/>
+        </w:rPr>
       </w:pPr>
       <w:r>
         <w:t xml:space="preserve">Klavier: </w:t>
@@ -64,6 +70,9 @@
     <w:p>
       <w:pPr>
         <w:pStyle w:val="Textkrper"/>
+        <w:rPr>
+          <w:rFonts w:hint="eastAsia"/>
+        </w:rPr>
       </w:pPr>
       <w:r>
         <w:t xml:space="preserve">Dampfschiff: </w:t>
@@ -97,7 +106,13 @@
         </w:rPr>
       </w:pPr>
       <w:r>
-        <w:t>Es ist der 05.05.2024, die Helden sind auf hoher See unterwegs um in Japan Hinweise zur zukünftigen Entstehung der Uhr zu finden und ihr Wissen in japanische Geister (Kami) und Dämonen (Yokai) auszubauen. Dort sollen sie von dem Historiker und Geisterkenner Ludwig Riess in Empfang genommen werden. Mit Hilfe der „</w:t>
+        <w:t>Es ist der 05.05.</w:t>
+      </w:r>
+      <w:r>
+        <w:t>1882</w:t>
+      </w:r>
+      <w:r>
+        <w:t>, die Helden sind auf hoher See unterwegs um in Japan Hinweise zur zukünftigen Entstehung der Uhr zu finden und ihr Wissen in japanische Geister (Kami) und Dämonen (Yokai) auszubauen. Dort sollen sie von dem Historiker und Geisterkenner Ludwig Riess in Empfang genommen werden. Mit Hilfe der „</w:t>
       </w:r>
       <w:r>
         <w:rPr>
@@ -164,6 +179,9 @@
     <w:p>
       <w:pPr>
         <w:pStyle w:val="Textkrper"/>
+        <w:rPr>
+          <w:rFonts w:hint="eastAsia"/>
+        </w:rPr>
       </w:pPr>
       <w:r>
         <w:t xml:space="preserve">Auch treffen sie dort </w:t>
@@ -258,6 +276,9 @@
     <w:p>
       <w:pPr>
         <w:pStyle w:val="Textkrper"/>
+        <w:rPr>
+          <w:rFonts w:hint="eastAsia"/>
+        </w:rPr>
       </w:pPr>
       <w:r>
         <w:t xml:space="preserve">Die Helden werden auf die Zimmer verteilt und </w:t>
@@ -272,6 +293,9 @@
     <w:p>
       <w:pPr>
         <w:pStyle w:val="Textkrper"/>
+        <w:rPr>
+          <w:rFonts w:hint="eastAsia"/>
+        </w:rPr>
       </w:pPr>
       <w:r>
         <w:t>Am Morgen werden sie zum Frühstüc</w:t>
@@ -306,6 +330,9 @@
     <w:p>
       <w:pPr>
         <w:pStyle w:val="Textkrper"/>
+        <w:rPr>
+          <w:rFonts w:hint="eastAsia"/>
+        </w:rPr>
       </w:pPr>
       <w:r>
         <w:t xml:space="preserve">In der zweiten Nacht werden alle durch einen lauten Knall geweckt, dieser kommt aus einer kleinen Schreibstube. Dort liegen tot am Boden Sir Charles, getroffen von einem Messer im Hals, Botschafter Arinori, erschossen mit einem Gewehr und eine Bedienstete, Maria Maler, erschlagen mit einem Zepter von Dame Margarethe. Das Gewehr gehört zu Roger, das Messer </w:t>
@@ -320,6 +347,9 @@
     <w:p>
       <w:pPr>
         <w:pStyle w:val="Textkrper"/>
+        <w:rPr>
+          <w:rFonts w:hint="eastAsia"/>
+        </w:rPr>
       </w:pPr>
       <w:r>
         <w:t>Bei den Leichen liegt folgendes:</w:t>
@@ -613,6 +643,9 @@
     <w:p>
       <w:pPr>
         <w:pStyle w:val="Textkrper"/>
+        <w:rPr>
+          <w:rFonts w:hint="eastAsia"/>
+        </w:rPr>
       </w:pPr>
     </w:p>
     <w:p>
@@ -650,6 +683,7 @@
             <w:pPr>
               <w:pStyle w:val="Textkrper"/>
               <w:rPr>
+                <w:rFonts w:hint="eastAsia"/>
                 <w:sz w:val="16"/>
                 <w:szCs w:val="16"/>
               </w:rPr>
@@ -671,6 +705,7 @@
             <w:pPr>
               <w:pStyle w:val="Textkrper"/>
               <w:rPr>
+                <w:rFonts w:hint="eastAsia"/>
                 <w:sz w:val="16"/>
                 <w:szCs w:val="16"/>
               </w:rPr>
@@ -692,6 +727,7 @@
             <w:pPr>
               <w:pStyle w:val="Textkrper"/>
               <w:rPr>
+                <w:rFonts w:hint="eastAsia"/>
                 <w:sz w:val="16"/>
                 <w:szCs w:val="16"/>
               </w:rPr>
@@ -713,6 +749,7 @@
             <w:pPr>
               <w:pStyle w:val="Textkrper"/>
               <w:rPr>
+                <w:rFonts w:hint="eastAsia"/>
                 <w:sz w:val="16"/>
                 <w:szCs w:val="16"/>
               </w:rPr>
@@ -734,6 +771,7 @@
             <w:pPr>
               <w:pStyle w:val="Textkrper"/>
               <w:rPr>
+                <w:rFonts w:hint="eastAsia"/>
                 <w:sz w:val="16"/>
                 <w:szCs w:val="16"/>
               </w:rPr>
@@ -755,6 +793,7 @@
             <w:pPr>
               <w:pStyle w:val="Textkrper"/>
               <w:rPr>
+                <w:rFonts w:hint="eastAsia"/>
                 <w:sz w:val="16"/>
                 <w:szCs w:val="16"/>
               </w:rPr>
@@ -776,6 +815,7 @@
             <w:pPr>
               <w:pStyle w:val="Textkrper"/>
               <w:rPr>
+                <w:rFonts w:hint="eastAsia"/>
                 <w:sz w:val="16"/>
                 <w:szCs w:val="16"/>
               </w:rPr>
@@ -802,6 +842,7 @@
             <w:pPr>
               <w:pStyle w:val="Textkrper"/>
               <w:rPr>
+                <w:rFonts w:hint="eastAsia"/>
                 <w:sz w:val="16"/>
                 <w:szCs w:val="16"/>
               </w:rPr>
@@ -823,6 +864,7 @@
             <w:pPr>
               <w:pStyle w:val="Textkrper"/>
               <w:rPr>
+                <w:rFonts w:hint="eastAsia"/>
                 <w:sz w:val="16"/>
                 <w:szCs w:val="16"/>
               </w:rPr>
@@ -844,6 +886,7 @@
             <w:pPr>
               <w:pStyle w:val="Textkrper"/>
               <w:rPr>
+                <w:rFonts w:hint="eastAsia"/>
                 <w:sz w:val="16"/>
                 <w:szCs w:val="16"/>
               </w:rPr>
@@ -865,6 +908,7 @@
             <w:pPr>
               <w:pStyle w:val="Textkrper"/>
               <w:rPr>
+                <w:rFonts w:hint="eastAsia"/>
                 <w:sz w:val="16"/>
                 <w:szCs w:val="16"/>
               </w:rPr>
@@ -886,6 +930,7 @@
             <w:pPr>
               <w:pStyle w:val="Textkrper"/>
               <w:rPr>
+                <w:rFonts w:hint="eastAsia"/>
                 <w:sz w:val="16"/>
                 <w:szCs w:val="16"/>
               </w:rPr>
@@ -907,23 +952,17 @@
             <w:pPr>
               <w:pStyle w:val="Textkrper"/>
               <w:rPr>
-                <w:sz w:val="16"/>
-                <w:szCs w:val="16"/>
-              </w:rPr>
-            </w:pPr>
-            <w:r>
-              <w:rPr>
-                <w:sz w:val="16"/>
-                <w:szCs w:val="16"/>
-              </w:rPr>
-              <w:t xml:space="preserve">Maler/ </w:t>
-            </w:r>
-            <w:r>
-              <w:rPr>
-                <w:sz w:val="16"/>
-                <w:szCs w:val="16"/>
-              </w:rPr>
-              <w:t>Przcokisz</w:t>
+                <w:rFonts w:hint="eastAsia"/>
+                <w:sz w:val="16"/>
+                <w:szCs w:val="16"/>
+              </w:rPr>
+            </w:pPr>
+            <w:r>
+              <w:rPr>
+                <w:sz w:val="16"/>
+                <w:szCs w:val="16"/>
+              </w:rPr>
+              <w:t>Maler/ Przcokisz</w:t>
             </w:r>
           </w:p>
         </w:tc>
@@ -935,30 +974,17 @@
             <w:pPr>
               <w:pStyle w:val="Textkrper"/>
               <w:rPr>
-                <w:sz w:val="16"/>
-                <w:szCs w:val="16"/>
-              </w:rPr>
-            </w:pPr>
-            <w:r>
-              <w:rPr>
-                <w:sz w:val="16"/>
-                <w:szCs w:val="16"/>
-              </w:rPr>
-              <w:t>Openkopp/</w:t>
-            </w:r>
-            <w:r>
-              <w:rPr>
-                <w:sz w:val="16"/>
-                <w:szCs w:val="16"/>
-              </w:rPr>
-              <w:t xml:space="preserve">Streuß (richtig wäre hier </w:t>
-            </w:r>
-            <w:r>
-              <w:rPr>
-                <w:sz w:val="16"/>
-                <w:szCs w:val="16"/>
-              </w:rPr>
-              <w:t>Guilette</w:t>
+                <w:rFonts w:hint="eastAsia"/>
+                <w:sz w:val="16"/>
+                <w:szCs w:val="16"/>
+              </w:rPr>
+            </w:pPr>
+            <w:r>
+              <w:rPr>
+                <w:sz w:val="16"/>
+                <w:szCs w:val="16"/>
+              </w:rPr>
+              <w:t>Openkopp/Streuß (richtig wäre hier Guilette</w:t>
             </w:r>
             <w:r>
               <w:rPr>
@@ -981,11 +1007,17 @@
     <w:p>
       <w:pPr>
         <w:pStyle w:val="Textkrper"/>
+        <w:rPr>
+          <w:rFonts w:hint="eastAsia"/>
+        </w:rPr>
       </w:pPr>
     </w:p>
     <w:p>
       <w:pPr>
         <w:pStyle w:val="Textkrper"/>
+        <w:rPr>
+          <w:rFonts w:hint="eastAsia"/>
+        </w:rPr>
       </w:pPr>
       <w:r>
         <w:t>Im Foyer versucht die verbliebene Bedienung Heinrich Przcokisz zu verschwinden, doch wird er aufgehalten. (Es ist der Sir in Gestaltwandlung, versuchte zu fliehen).</w:t>
@@ -994,6 +1026,9 @@
     <w:p>
       <w:pPr>
         <w:pStyle w:val="Textkrper"/>
+        <w:rPr>
+          <w:rFonts w:hint="eastAsia"/>
+        </w:rPr>
       </w:pPr>
       <w:r>
         <w:t>Akane weißt darauf hin, dass der Mord am Botschafter weitreichende F</w:t>
@@ -1040,6 +1075,9 @@
     <w:p>
       <w:pPr>
         <w:pStyle w:val="berschrift3"/>
+        <w:rPr>
+          <w:rFonts w:hint="eastAsia"/>
+        </w:rPr>
       </w:pPr>
       <w:r>
         <w:t>Schluss</w:t>
@@ -1048,6 +1086,9 @@
     <w:p>
       <w:pPr>
         <w:pStyle w:val="Textkrper"/>
+        <w:rPr>
+          <w:rFonts w:hint="eastAsia"/>
+        </w:rPr>
       </w:pPr>
       <w:r>
         <w:t>Abhängig vom Ergebnis der Ermittlungen werden die Helden behandelt. Es kann zum Einsperren einzelner Personen kommen, zum wirklichen Lösen des Falls rund um den Gestaltwandler oder nichts passiert außer ein Gefühl von Unbehagen.</w:t>
@@ -1064,7 +1105,7 @@
 </file>
 
 <file path=word/numbering.xml><?xml version="1.0" encoding="utf-8"?>
-<w:numbering xmlns:wpc="http://schemas.microsoft.com/office/word/2010/wordprocessingCanvas" xmlns:cx="http://schemas.microsoft.com/office/drawing/2014/chartex" xmlns:cx1="http://schemas.microsoft.com/office/drawing/2015/9/8/chartex" xmlns:cx2="http://schemas.microsoft.com/office/drawing/2015/10/21/chartex" xmlns:cx3="http://schemas.microsoft.com/office/drawing/2016/5/9/chartex" xmlns:cx4="http://schemas.microsoft.com/office/drawing/2016/5/10/chartex" xmlns:cx5="http://schemas.microsoft.com/office/drawing/2016/5/11/chartex" xmlns:cx6="http://schemas.microsoft.com/office/drawing/2016/5/12/chartex" xmlns:cx7="http://schemas.microsoft.com/office/drawing/2016/5/13/chartex" xmlns:cx8="http://schemas.microsoft.com/office/drawing/2016/5/14/chartex" xmlns:mc="http://schemas.openxmlformats.org/markup-compatibility/2006" xmlns:aink="http://schemas.microsoft.com/office/drawing/2016/ink" xmlns:am3d="http://schemas.microsoft.com/office/drawing/2017/model3d" xmlns:o="urn:schemas-microsoft-com:office:office" xmlns:oel="http://schemas.microsoft.com/office/2019/extlst" xmlns:r="http://schemas.openxmlformats.org/officeDocument/2006/relationships" xmlns:m="http://schemas.openxmlformats.org/officeDocument/2006/math" xmlns:v="urn:schemas-microsoft-com:vml" xmlns:wp14="http://schemas.microsoft.com/office/word/2010/wordprocessingDrawing" xmlns:wp="http://schemas.openxmlformats.org/drawingml/2006/wordprocessingDrawing" xmlns:w10="urn:schemas-microsoft-com:office:word" xmlns:w="http://schemas.openxmlformats.org/wordprocessingml/2006/main" xmlns:w14="http://schemas.microsoft.com/office/word/2010/wordml" xmlns:w15="http://schemas.microsoft.com/office/word/2012/wordml" xmlns:w16cex="http://schemas.microsoft.com/office/word/2018/wordml/cex" xmlns:w16cid="http://schemas.microsoft.com/office/word/2016/wordml/cid" xmlns:w16="http://schemas.microsoft.com/office/word/2018/wordml" xmlns:w16du="http://schemas.microsoft.com/office/word/2023/wordml/word16du" xmlns:w16sdtdh="http://schemas.microsoft.com/office/word/2020/wordml/sdtdatahash" xmlns:w16se="http://schemas.microsoft.com/office/word/2015/wordml/symex" xmlns:wpg="http://schemas.microsoft.com/office/word/2010/wordprocessingGroup" xmlns:wpi="http://schemas.microsoft.com/office/word/2010/wordprocessingInk" xmlns:wne="http://schemas.microsoft.com/office/word/2006/wordml" xmlns:wps="http://schemas.microsoft.com/office/word/2010/wordprocessingShape" mc:Ignorable="w14 w15 w16se w16cid w16 w16cex w16sdtdh w16du wp14">
+<w:numbering xmlns:wpc="http://schemas.microsoft.com/office/word/2010/wordprocessingCanvas" xmlns:cx="http://schemas.microsoft.com/office/drawing/2014/chartex" xmlns:cx1="http://schemas.microsoft.com/office/drawing/2015/9/8/chartex" xmlns:cx2="http://schemas.microsoft.com/office/drawing/2015/10/21/chartex" xmlns:cx3="http://schemas.microsoft.com/office/drawing/2016/5/9/chartex" xmlns:cx4="http://schemas.microsoft.com/office/drawing/2016/5/10/chartex" xmlns:cx5="http://schemas.microsoft.com/office/drawing/2016/5/11/chartex" xmlns:cx6="http://schemas.microsoft.com/office/drawing/2016/5/12/chartex" xmlns:cx7="http://schemas.microsoft.com/office/drawing/2016/5/13/chartex" xmlns:cx8="http://schemas.microsoft.com/office/drawing/2016/5/14/chartex" xmlns:mc="http://schemas.openxmlformats.org/markup-compatibility/2006" xmlns:aink="http://schemas.microsoft.com/office/drawing/2016/ink" xmlns:am3d="http://schemas.microsoft.com/office/drawing/2017/model3d" xmlns:o="urn:schemas-microsoft-com:office:office" xmlns:oel="http://schemas.microsoft.com/office/2019/extlst" xmlns:r="http://schemas.openxmlformats.org/officeDocument/2006/relationships" xmlns:m="http://schemas.openxmlformats.org/officeDocument/2006/math" xmlns:v="urn:schemas-microsoft-com:vml" xmlns:wp14="http://schemas.microsoft.com/office/word/2010/wordprocessingDrawing" xmlns:wp="http://schemas.openxmlformats.org/drawingml/2006/wordprocessingDrawing" xmlns:w10="urn:schemas-microsoft-com:office:word" xmlns:w="http://schemas.openxmlformats.org/wordprocessingml/2006/main" xmlns:w14="http://schemas.microsoft.com/office/word/2010/wordml" xmlns:w15="http://schemas.microsoft.com/office/word/2012/wordml" xmlns:w16cex="http://schemas.microsoft.com/office/word/2018/wordml/cex" xmlns:w16cid="http://schemas.microsoft.com/office/word/2016/wordml/cid" xmlns:w16="http://schemas.microsoft.com/office/word/2018/wordml" xmlns:w16du="http://schemas.microsoft.com/office/word/2023/wordml/word16du" xmlns:w16sdtdh="http://schemas.microsoft.com/office/word/2020/wordml/sdtdatahash" xmlns:w16sdtfl="http://schemas.microsoft.com/office/word/2024/wordml/sdtformatlock" xmlns:w16se="http://schemas.microsoft.com/office/word/2015/wordml/symex" xmlns:wpg="http://schemas.microsoft.com/office/word/2010/wordprocessingGroup" xmlns:wpi="http://schemas.microsoft.com/office/word/2010/wordprocessingInk" xmlns:wne="http://schemas.microsoft.com/office/word/2006/wordml" xmlns:wps="http://schemas.microsoft.com/office/word/2010/wordprocessingShape" mc:Ignorable="w14 w15 w16se w16cid w16 w16cex w16sdtdh w16sdtfl w16du wp14">
   <w:abstractNum w:abstractNumId="0" w15:restartNumberingAfterBreak="0">
     <w:nsid w:val="0B7B1DA5"/>
     <w:multiLevelType w:val="multilevel"/>
@@ -1197,7 +1238,7 @@
 </file>
 
 <file path=word/styles.xml><?xml version="1.0" encoding="utf-8"?>
-<w:styles xmlns:mc="http://schemas.openxmlformats.org/markup-compatibility/2006" xmlns:r="http://schemas.openxmlformats.org/officeDocument/2006/relationships" xmlns:w="http://schemas.openxmlformats.org/wordprocessingml/2006/main" xmlns:w14="http://schemas.microsoft.com/office/word/2010/wordml" xmlns:w15="http://schemas.microsoft.com/office/word/2012/wordml" xmlns:w16cex="http://schemas.microsoft.com/office/word/2018/wordml/cex" xmlns:w16cid="http://schemas.microsoft.com/office/word/2016/wordml/cid" xmlns:w16="http://schemas.microsoft.com/office/word/2018/wordml" xmlns:w16du="http://schemas.microsoft.com/office/word/2023/wordml/word16du" xmlns:w16sdtdh="http://schemas.microsoft.com/office/word/2020/wordml/sdtdatahash" xmlns:w16se="http://schemas.microsoft.com/office/word/2015/wordml/symex" mc:Ignorable="w14 w15 w16se w16cid w16 w16cex w16sdtdh w16du">
+<w:styles xmlns:mc="http://schemas.openxmlformats.org/markup-compatibility/2006" xmlns:r="http://schemas.openxmlformats.org/officeDocument/2006/relationships" xmlns:w="http://schemas.openxmlformats.org/wordprocessingml/2006/main" xmlns:w14="http://schemas.microsoft.com/office/word/2010/wordml" xmlns:w15="http://schemas.microsoft.com/office/word/2012/wordml" xmlns:w16cex="http://schemas.microsoft.com/office/word/2018/wordml/cex" xmlns:w16cid="http://schemas.microsoft.com/office/word/2016/wordml/cid" xmlns:w16="http://schemas.microsoft.com/office/word/2018/wordml" xmlns:w16du="http://schemas.microsoft.com/office/word/2023/wordml/word16du" xmlns:w16sdtdh="http://schemas.microsoft.com/office/word/2020/wordml/sdtdatahash" xmlns:w16sdtfl="http://schemas.microsoft.com/office/word/2024/wordml/sdtformatlock" xmlns:w16se="http://schemas.microsoft.com/office/word/2015/wordml/symex" mc:Ignorable="w14 w15 w16se w16cid w16 w16cex w16sdtdh w16sdtfl w16du">
   <w:docDefaults>
     <w:rPrDefault>
       <w:rPr>

</xml_diff>